<commit_message>
updated template and fixed state tracking of updated cv sections
</commit_message>
<xml_diff>
--- a/public/cv_template.docx
+++ b/public/cv_template.docx
@@ -572,7 +572,7 @@
           </mc:Choice>
           <mc:Fallback>
             <w:pict>
-              <v:group w14:anchorId="5E37FC22" id="Group 2" o:spid="_x0000_s1026" style="position:absolute;margin-left:42.5pt;margin-top:4.9pt;width:14.7pt;height:14.7pt;z-index:251657216;mso-wrap-distance-left:0;mso-wrap-distance-right:0;mso-position-horizontal-relative:page" coordsize="186690,186690" o:gfxdata="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">
+              <v:group w14:anchorId="7040A4F4" id="Group 2" o:spid="_x0000_s1026" style="position:absolute;margin-left:42.5pt;margin-top:4.9pt;width:14.7pt;height:14.7pt;z-index:251657216;mso-wrap-distance-left:0;mso-wrap-distance-right:0;mso-position-horizontal-relative:page" coordsize="186690,186690" o:gfxdata="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">
                 <v:shape id="Graphic 3" o:spid="_x0000_s1027" style="position:absolute;width:186690;height:186690;visibility:visible;mso-wrap-style:square;v-text-anchor:top" coordsize="186690,186690" o:gfxdata="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" path="m186213,186213l,186213,,,186213,r,186213xe" fillcolor="#003a9a" stroked="f">
                   <v:fill opacity="39321f"/>
                   <v:path arrowok="t"/>
@@ -995,7 +995,7 @@
           </mc:Choice>
           <mc:Fallback>
             <w:pict>
-              <v:group w14:anchorId="04C761B0" id="Group 5" o:spid="_x0000_s1026" style="position:absolute;margin-left:42.5pt;margin-top:24.05pt;width:14.7pt;height:14.7pt;z-index:251658240;mso-wrap-distance-left:0;mso-wrap-distance-right:0;mso-position-horizontal-relative:page" coordsize="186690,186690" o:gfxdata="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">
+              <v:group w14:anchorId="54BDF6E7" id="Group 5" o:spid="_x0000_s1026" style="position:absolute;margin-left:42.5pt;margin-top:24.05pt;width:14.7pt;height:14.7pt;z-index:251658240;mso-wrap-distance-left:0;mso-wrap-distance-right:0;mso-position-horizontal-relative:page" coordsize="186690,186690" o:gfxdata="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">
                 <v:shape id="Graphic 6" o:spid="_x0000_s1027" style="position:absolute;width:186690;height:186690;visibility:visible;mso-wrap-style:square;v-text-anchor:top" coordsize="186690,186690" o:gfxdata="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" path="m186213,186213l,186213,,,186213,r,186213xe" fillcolor="#003a9a" stroked="f">
                   <v:fill opacity="39321f"/>
                   <v:path arrowok="t"/>
@@ -1083,9 +1083,8 @@
           <w:spacing w:val="-2"/>
           <w:u w:color="003A9A"/>
         </w:rPr>
-        <w:t>{#</w:t>
-      </w:r>
-      <w:proofErr w:type="gramStart"/>
+        <w:t>{#hasSummary}</w:t>
+      </w:r>
       <w:r>
         <w:rPr>
           <w:b w:val="0"/>
@@ -1093,18 +1092,8 @@
           <w:spacing w:val="-2"/>
           <w:u w:color="003A9A"/>
         </w:rPr>
-        <w:t>hasSummary}</w:t>
-      </w:r>
-      <w:r>
-        <w:rPr>
-          <w:b w:val="0"/>
-          <w:color w:val="003A9A"/>
-          <w:spacing w:val="-2"/>
-          <w:u w:color="003A9A"/>
-        </w:rPr>
         <w:t>SUMMARY</w:t>
       </w:r>
-      <w:proofErr w:type="gramEnd"/>
       <w:r>
         <w:rPr>
           <w:b w:val="0"/>
@@ -1137,31 +1126,15 @@
           <w:color w:val="737373"/>
           <w:sz w:val="18"/>
         </w:rPr>
-        <w:t>summary_</w:t>
-      </w:r>
-      <w:proofErr w:type="gramStart"/>
+        <w:t>summary_text</w:t>
+      </w:r>
+      <w:proofErr w:type="spellEnd"/>
       <w:r>
         <w:rPr>
           <w:color w:val="737373"/>
           <w:sz w:val="18"/>
         </w:rPr>
-        <w:t>text</w:t>
-      </w:r>
-      <w:proofErr w:type="spellEnd"/>
-      <w:r>
-        <w:rPr>
-          <w:color w:val="737373"/>
-          <w:sz w:val="18"/>
-        </w:rPr>
-        <w:t>}{</w:t>
-      </w:r>
-      <w:proofErr w:type="gramEnd"/>
-      <w:r>
-        <w:rPr>
-          <w:color w:val="737373"/>
-          <w:sz w:val="18"/>
-        </w:rPr>
-        <w:t>/}</w:t>
+        <w:t>}{/}</w:t>
       </w:r>
     </w:p>
     <w:p>
@@ -1185,17 +1158,7 @@
           <w:w w:val="90"/>
           <w:u w:color="003A9A"/>
         </w:rPr>
-        <w:t>{#</w:t>
-      </w:r>
-      <w:proofErr w:type="gramStart"/>
-      <w:r>
-        <w:rPr>
-          <w:color w:val="003A9A"/>
-          <w:spacing w:val="-2"/>
-          <w:w w:val="90"/>
-          <w:u w:color="003A9A"/>
-        </w:rPr>
-        <w:t>hasExperience}</w:t>
+        <w:t>{#hasExperience}</w:t>
       </w:r>
       <w:r>
         <w:rPr>
@@ -1207,7 +1170,6 @@
         </w:rPr>
         <w:t>EXPERIENCE</w:t>
       </w:r>
-      <w:proofErr w:type="gramEnd"/>
       <w:r>
         <w:rPr>
           <w:b w:val="0"/>
@@ -1231,15 +1193,7 @@
           <w:color w:val="737373"/>
           <w:sz w:val="18"/>
         </w:rPr>
-        <w:t>{#</w:t>
-      </w:r>
-      <w:proofErr w:type="gramStart"/>
-      <w:r>
-        <w:rPr>
-          <w:color w:val="737373"/>
-          <w:sz w:val="18"/>
-        </w:rPr>
-        <w:t>experience}</w:t>
+        <w:t>{#experience}</w:t>
       </w:r>
       <w:r>
         <w:rPr>
@@ -1248,17 +1202,7 @@
           <w:sz w:val="19"/>
           <w:u w:val="single" w:color="737373"/>
         </w:rPr>
-        <w:t>{</w:t>
-      </w:r>
-      <w:proofErr w:type="gramEnd"/>
-      <w:r>
-        <w:rPr>
-          <w:rFonts w:ascii="Arial Black" w:hAnsi="Arial Black"/>
-          <w:color w:val="737373"/>
-          <w:sz w:val="19"/>
-          <w:u w:val="single" w:color="737373"/>
-        </w:rPr>
-        <w:t>title}</w:t>
+        <w:t>{title}</w:t>
       </w:r>
       <w:r>
         <w:rPr>
@@ -1308,18 +1252,24 @@
         <w:spacing w:before="132"/>
         <w:ind w:left="141"/>
         <w:rPr>
+          <w:sz w:val="18"/>
+        </w:rPr>
+      </w:pPr>
+      <w:r>
+        <w:rPr>
           <w:color w:val="737373"/>
           <w:sz w:val="19"/>
           <w:u w:val="single" w:color="737373"/>
         </w:rPr>
-      </w:pPr>
+        <w:t>{#bullets}</w:t>
+      </w:r>
       <w:r>
         <w:rPr>
           <w:color w:val="737373"/>
           <w:sz w:val="19"/>
           <w:u w:val="single" w:color="737373"/>
         </w:rPr>
-        <w:t>{#bullets}</w:t>
+        <w:t xml:space="preserve"> </w:t>
       </w:r>
       <w:r>
         <w:rPr>
@@ -1327,7 +1277,7 @@
           <w:sz w:val="19"/>
           <w:u w:val="single" w:color="737373"/>
         </w:rPr>
-        <w:t xml:space="preserve"> </w:t>
+        <w:t>▪</w:t>
       </w:r>
       <w:r>
         <w:rPr>
@@ -1335,35 +1285,28 @@
           <w:sz w:val="19"/>
           <w:u w:val="single" w:color="737373"/>
         </w:rPr>
-        <w:t>▪</w:t>
-      </w:r>
-      <w:r>
-        <w:rPr>
-          <w:color w:val="737373"/>
-          <w:sz w:val="19"/>
-          <w:u w:val="single" w:color="737373"/>
-        </w:rPr>
         <w:t xml:space="preserve"> </w:t>
       </w:r>
       <w:r>
         <w:rPr>
           <w:sz w:val="18"/>
         </w:rPr>
-        <w:t>{text</w:t>
-      </w:r>
-      <w:proofErr w:type="gramStart"/>
-      <w:r>
+        <w:t>{text}</w:t>
+      </w:r>
+    </w:p>
+    <w:p>
+      <w:pPr>
+        <w:spacing w:before="132"/>
+        <w:ind w:left="141"/>
         <w:rPr>
           <w:sz w:val="18"/>
         </w:rPr>
-        <w:t>}{/}{/}{</w:t>
-      </w:r>
-      <w:proofErr w:type="gramEnd"/>
+      </w:pPr>
       <w:r>
         <w:rPr>
           <w:sz w:val="18"/>
         </w:rPr>
-        <w:t>/}</w:t>
+        <w:t>{/}{/}{/}</w:t>
       </w:r>
     </w:p>
     <w:p>
@@ -1386,9 +1329,8 @@
           <w:w w:val="95"/>
           <w:u w:color="003A9A"/>
         </w:rPr>
-        <w:t>{#</w:t>
-      </w:r>
-      <w:proofErr w:type="gramStart"/>
+        <w:t>{#hasEducation}</w:t>
+      </w:r>
       <w:r>
         <w:rPr>
           <w:b w:val="0"/>
@@ -1397,19 +1339,8 @@
           <w:w w:val="95"/>
           <w:u w:color="003A9A"/>
         </w:rPr>
-        <w:t>hasEducation}</w:t>
-      </w:r>
-      <w:r>
-        <w:rPr>
-          <w:b w:val="0"/>
-          <w:color w:val="003A9A"/>
-          <w:spacing w:val="-2"/>
-          <w:w w:val="95"/>
-          <w:u w:color="003A9A"/>
-        </w:rPr>
         <w:t>EDUCATION</w:t>
       </w:r>
-      <w:proofErr w:type="gramEnd"/>
       <w:r>
         <w:rPr>
           <w:b w:val="0"/>
@@ -1525,46 +1456,65 @@
           <w:color w:val="737373"/>
           <w:sz w:val="18"/>
         </w:rPr>
-        <w:t>{#</w:t>
-      </w:r>
-      <w:proofErr w:type="gramStart"/>
+        <w:t>{#result}</w:t>
+      </w:r>
       <w:r>
         <w:rPr>
           <w:color w:val="737373"/>
           <w:sz w:val="18"/>
         </w:rPr>
-        <w:t>result}</w:t>
+        <w:t>| {result}</w:t>
       </w:r>
       <w:r>
         <w:rPr>
           <w:color w:val="737373"/>
           <w:sz w:val="18"/>
         </w:rPr>
-        <w:t>|</w:t>
-      </w:r>
-      <w:proofErr w:type="gramEnd"/>
+        <w:t xml:space="preserve"> </w:t>
+      </w:r>
       <w:r>
         <w:rPr>
           <w:color w:val="737373"/>
           <w:sz w:val="18"/>
         </w:rPr>
-        <w:t xml:space="preserve"> {result}</w:t>
+        <w:t>{</w:t>
       </w:r>
       <w:r>
         <w:rPr>
           <w:color w:val="737373"/>
           <w:sz w:val="18"/>
         </w:rPr>
-        <w:t xml:space="preserve"> </w:t>
+        <w:t>/</w:t>
       </w:r>
       <w:r>
         <w:rPr>
           <w:color w:val="737373"/>
           <w:sz w:val="18"/>
         </w:rPr>
+        <w:t>}</w:t>
+      </w:r>
+    </w:p>
+    <w:p>
+      <w:pPr>
+        <w:pStyle w:val="ListParagraph"/>
+        <w:tabs>
+          <w:tab w:val="left" w:pos="446"/>
+          <w:tab w:val="left" w:pos="462"/>
+        </w:tabs>
+        <w:spacing w:before="79" w:line="259" w:lineRule="auto"/>
+        <w:ind w:left="462" w:right="4162"/>
+        <w:rPr>
+          <w:color w:val="737373"/>
+          <w:sz w:val="18"/>
+        </w:rPr>
+      </w:pPr>
+      <w:r>
+        <w:rPr>
+          <w:color w:val="737373"/>
+          <w:sz w:val="18"/>
+        </w:rPr>
         <w:t>{</w:t>
       </w:r>
-      <w:proofErr w:type="gramStart"/>
       <w:r>
         <w:rPr>
           <w:color w:val="737373"/>
@@ -1586,28 +1536,6 @@
         </w:rPr>
         <w:t>{</w:t>
       </w:r>
-      <w:r>
-        <w:rPr>
-          <w:color w:val="737373"/>
-          <w:sz w:val="18"/>
-        </w:rPr>
-        <w:t>/</w:t>
-      </w:r>
-      <w:r>
-        <w:rPr>
-          <w:color w:val="737373"/>
-          <w:sz w:val="18"/>
-        </w:rPr>
-        <w:t>}</w:t>
-      </w:r>
-      <w:r>
-        <w:rPr>
-          <w:color w:val="737373"/>
-          <w:sz w:val="18"/>
-        </w:rPr>
-        <w:t>{</w:t>
-      </w:r>
-      <w:proofErr w:type="gramEnd"/>
       <w:r>
         <w:rPr>
           <w:color w:val="737373"/>
@@ -1643,9 +1571,8 @@
           <w:w w:val="95"/>
           <w:u w:color="003A9A"/>
         </w:rPr>
-        <w:t>{#</w:t>
-      </w:r>
-      <w:proofErr w:type="gramStart"/>
+        <w:t>{#hasTraining}</w:t>
+      </w:r>
       <w:r>
         <w:rPr>
           <w:b w:val="0"/>
@@ -1654,19 +1581,8 @@
           <w:w w:val="95"/>
           <w:u w:color="003A9A"/>
         </w:rPr>
-        <w:t>hasTraining}</w:t>
-      </w:r>
-      <w:r>
-        <w:rPr>
-          <w:b w:val="0"/>
-          <w:color w:val="003A9A"/>
-          <w:spacing w:val="-2"/>
-          <w:w w:val="95"/>
-          <w:u w:color="003A9A"/>
-        </w:rPr>
         <w:t>TRAINING</w:t>
       </w:r>
-      <w:proofErr w:type="gramEnd"/>
       <w:r>
         <w:rPr>
           <w:b w:val="0"/>
@@ -1696,34 +1612,97 @@
       <w:r>
         <w:rPr>
           <w:b w:val="0"/>
+          <w:color w:val="737373"/>
+        </w:rPr>
+        <w:t>{title}</w:t>
+      </w:r>
+      <w:r>
+        <w:rPr>
+          <w:b w:val="0"/>
+          <w:color w:val="737373"/>
         </w:rPr>
         <w:t xml:space="preserve"> </w:t>
-      </w:r>
-      <w:r>
-        <w:rPr>
-          <w:b w:val="0"/>
-        </w:rPr>
-        <w:t>▪</w:t>
-      </w:r>
-      <w:r>
-        <w:rPr>
-          <w:b w:val="0"/>
-        </w:rPr>
-        <w:t xml:space="preserve"> </w:t>
-      </w:r>
-      <w:r>
-        <w:rPr>
-          <w:b w:val="0"/>
-          <w:color w:val="737373"/>
-        </w:rPr>
-        <w:t>{title}</w:t>
       </w:r>
     </w:p>
     <w:p>
       <w:pPr>
         <w:pStyle w:val="BodyText"/>
         <w:spacing w:before="47"/>
-        <w:ind w:left="0"/>
+        <w:ind w:left="0" w:firstLine="216"/>
+        <w:rPr>
+          <w:color w:val="737373"/>
+          <w:spacing w:val="2"/>
+        </w:rPr>
+      </w:pPr>
+      <w:r>
+        <w:rPr>
+          <w:color w:val="737373"/>
+          <w:spacing w:val="2"/>
+        </w:rPr>
+        <w:t>{#provider}</w:t>
+      </w:r>
+      <w:r>
+        <w:rPr>
+          <w:color w:val="737373"/>
+          <w:spacing w:val="2"/>
+        </w:rPr>
+        <w:t xml:space="preserve"> </w:t>
+      </w:r>
+      <w:r>
+        <w:rPr>
+          <w:color w:val="737373"/>
+          <w:spacing w:val="2"/>
+        </w:rPr>
+        <w:t>{provider}{</w:t>
+      </w:r>
+      <w:r>
+        <w:rPr>
+          <w:color w:val="737373"/>
+          <w:spacing w:val="2"/>
+        </w:rPr>
+        <w:t>/</w:t>
+      </w:r>
+      <w:r>
+        <w:rPr>
+          <w:color w:val="737373"/>
+          <w:spacing w:val="2"/>
+        </w:rPr>
+        <w:t>} {</w:t>
+      </w:r>
+      <w:r>
+        <w:rPr>
+          <w:color w:val="737373"/>
+          <w:spacing w:val="2"/>
+        </w:rPr>
+        <w:t>#</w:t>
+      </w:r>
+      <w:r>
+        <w:rPr>
+          <w:color w:val="737373"/>
+          <w:spacing w:val="2"/>
+        </w:rPr>
+        <w:t>year}{year}{</w:t>
+      </w:r>
+      <w:r>
+        <w:rPr>
+          <w:color w:val="737373"/>
+          <w:spacing w:val="2"/>
+        </w:rPr>
+        <w:t>/</w:t>
+      </w:r>
+      <w:r>
+        <w:rPr>
+          <w:color w:val="737373"/>
+          <w:spacing w:val="2"/>
+        </w:rPr>
+        <w:t>}</w:t>
+      </w:r>
+    </w:p>
+    <w:p>
+      <w:pPr>
+        <w:pStyle w:val="BodyText"/>
+        <w:spacing w:before="47"/>
+        <w:ind w:left="0" w:firstLine="141"/>
         <w:rPr>
           <w:color w:val="737373"/>
           <w:spacing w:val="2"/>
@@ -1740,22 +1719,21 @@
           <w:color w:val="737373"/>
           <w:spacing w:val="2"/>
         </w:rPr>
-        <w:t xml:space="preserve">    </w:t>
+        <w:t>{</w:t>
       </w:r>
       <w:r>
         <w:rPr>
           <w:color w:val="737373"/>
           <w:spacing w:val="2"/>
         </w:rPr>
-        <w:t>{#</w:t>
-      </w:r>
-      <w:proofErr w:type="gramStart"/>
+        <w:t>/</w:t>
+      </w:r>
       <w:r>
         <w:rPr>
           <w:color w:val="737373"/>
           <w:spacing w:val="2"/>
         </w:rPr>
-        <w:t>provider}</w:t>
+        <w:t>}</w:t>
       </w:r>
       <w:r>
         <w:rPr>
@@ -1764,125 +1742,6 @@
         </w:rPr>
         <w:t>{</w:t>
       </w:r>
-      <w:proofErr w:type="gramEnd"/>
-      <w:r>
-        <w:rPr>
-          <w:color w:val="737373"/>
-          <w:spacing w:val="2"/>
-        </w:rPr>
-        <w:t>provider</w:t>
-      </w:r>
-      <w:proofErr w:type="gramStart"/>
-      <w:r>
-        <w:rPr>
-          <w:color w:val="737373"/>
-          <w:spacing w:val="2"/>
-        </w:rPr>
-        <w:t>}{</w:t>
-      </w:r>
-      <w:proofErr w:type="gramEnd"/>
-      <w:r>
-        <w:rPr>
-          <w:color w:val="737373"/>
-          <w:spacing w:val="2"/>
-        </w:rPr>
-        <w:t>/</w:t>
-      </w:r>
-      <w:r>
-        <w:rPr>
-          <w:color w:val="737373"/>
-          <w:spacing w:val="2"/>
-        </w:rPr>
-        <w:t>}</w:t>
-      </w:r>
-      <w:r>
-        <w:rPr>
-          <w:color w:val="737373"/>
-          <w:spacing w:val="2"/>
-        </w:rPr>
-        <w:t>,</w:t>
-      </w:r>
-      <w:r>
-        <w:rPr>
-          <w:color w:val="737373"/>
-          <w:spacing w:val="2"/>
-        </w:rPr>
-        <w:t xml:space="preserve"> {</w:t>
-      </w:r>
-      <w:r>
-        <w:rPr>
-          <w:color w:val="737373"/>
-          <w:spacing w:val="2"/>
-        </w:rPr>
-        <w:t>#</w:t>
-      </w:r>
-      <w:proofErr w:type="gramStart"/>
-      <w:r>
-        <w:rPr>
-          <w:color w:val="737373"/>
-          <w:spacing w:val="2"/>
-        </w:rPr>
-        <w:t>year}{</w:t>
-      </w:r>
-      <w:proofErr w:type="gramEnd"/>
-      <w:r>
-        <w:rPr>
-          <w:color w:val="737373"/>
-          <w:spacing w:val="2"/>
-        </w:rPr>
-        <w:t>year</w:t>
-      </w:r>
-      <w:proofErr w:type="gramStart"/>
-      <w:r>
-        <w:rPr>
-          <w:color w:val="737373"/>
-          <w:spacing w:val="2"/>
-        </w:rPr>
-        <w:t>}{</w:t>
-      </w:r>
-      <w:r>
-        <w:rPr>
-          <w:color w:val="737373"/>
-          <w:spacing w:val="2"/>
-        </w:rPr>
-        <w:t>/</w:t>
-      </w:r>
-      <w:r>
-        <w:rPr>
-          <w:color w:val="737373"/>
-          <w:spacing w:val="2"/>
-        </w:rPr>
-        <w:t>}</w:t>
-      </w:r>
-      <w:r>
-        <w:rPr>
-          <w:color w:val="737373"/>
-          <w:spacing w:val="2"/>
-        </w:rPr>
-        <w:t>{</w:t>
-      </w:r>
-      <w:r>
-        <w:rPr>
-          <w:color w:val="737373"/>
-          <w:spacing w:val="2"/>
-        </w:rPr>
-        <w:t>/</w:t>
-      </w:r>
-      <w:r>
-        <w:rPr>
-          <w:color w:val="737373"/>
-          <w:spacing w:val="2"/>
-        </w:rPr>
-        <w:t>}</w:t>
-      </w:r>
-      <w:r>
-        <w:rPr>
-          <w:color w:val="737373"/>
-          <w:spacing w:val="2"/>
-        </w:rPr>
-        <w:t>{</w:t>
-      </w:r>
-      <w:proofErr w:type="gramEnd"/>
       <w:r>
         <w:rPr>
           <w:color w:val="737373"/>
@@ -1935,9 +1794,8 @@
           <w:w w:val="95"/>
           <w:u w:color="003A9A"/>
         </w:rPr>
-        <w:t>#</w:t>
-      </w:r>
-      <w:proofErr w:type="gramStart"/>
+        <w:t>#hasOthers</w:t>
+      </w:r>
       <w:r>
         <w:rPr>
           <w:b w:val="0"/>
@@ -1946,7 +1804,7 @@
           <w:w w:val="95"/>
           <w:u w:color="003A9A"/>
         </w:rPr>
-        <w:t>hasOthers</w:t>
+        <w:t>}</w:t>
       </w:r>
       <w:r>
         <w:rPr>
@@ -1956,19 +1814,8 @@
           <w:w w:val="95"/>
           <w:u w:color="003A9A"/>
         </w:rPr>
-        <w:t>}</w:t>
-      </w:r>
-      <w:r>
-        <w:rPr>
-          <w:b w:val="0"/>
-          <w:color w:val="003A9A"/>
-          <w:spacing w:val="-2"/>
-          <w:w w:val="95"/>
-          <w:u w:color="003A9A"/>
-        </w:rPr>
         <w:t>OTHERS</w:t>
       </w:r>
-      <w:proofErr w:type="gramEnd"/>
       <w:r>
         <w:rPr>
           <w:b w:val="0"/>
@@ -2023,21 +1870,17 @@
               <w:pStyle w:val="BodyText"/>
               <w:spacing w:before="85" w:line="259" w:lineRule="auto"/>
               <w:ind w:left="0" w:right="38"/>
+              <w:rPr>
+                <w:sz w:val="20"/>
+                <w:szCs w:val="20"/>
+              </w:rPr>
             </w:pPr>
             <w:r>
               <w:rPr>
                 <w:sz w:val="20"/>
                 <w:szCs w:val="20"/>
               </w:rPr>
-              <w:t>{#others_</w:t>
-            </w:r>
-            <w:proofErr w:type="gramStart"/>
-            <w:r>
-              <w:rPr>
-                <w:sz w:val="20"/>
-                <w:szCs w:val="20"/>
-              </w:rPr>
-              <w:t>rows}</w:t>
+              <w:t>{#others_rows}</w:t>
             </w:r>
             <w:r>
               <w:rPr>
@@ -2046,7 +1889,6 @@
               </w:rPr>
               <w:t>{</w:t>
             </w:r>
-            <w:proofErr w:type="gramEnd"/>
             <w:r>
               <w:rPr>
                 <w:sz w:val="20"/>
@@ -2054,7 +1896,6 @@
               </w:rPr>
               <w:t>#</w:t>
             </w:r>
-            <w:proofErr w:type="gramStart"/>
             <w:r>
               <w:rPr>
                 <w:sz w:val="20"/>
@@ -2069,17 +1910,7 @@
                 <w:sz w:val="20"/>
                 <w:szCs w:val="20"/>
               </w:rPr>
-              <w:t>{</w:t>
-            </w:r>
-            <w:proofErr w:type="gramEnd"/>
-            <w:r>
-              <w:rPr>
-                <w:b/>
-                <w:bCs/>
-                <w:sz w:val="20"/>
-                <w:szCs w:val="20"/>
-              </w:rPr>
-              <w:t>title}</w:t>
+              <w:t>{title}</w:t>
             </w:r>
             <w:r>
               <w:rPr>
@@ -2093,11 +1924,7 @@
             </w:r>
             <w:proofErr w:type="spellStart"/>
             <w:r>
-              <w:t>left_items_</w:t>
-            </w:r>
-            <w:proofErr w:type="gramStart"/>
-            <w:r>
-              <w:t>joined</w:t>
+              <w:t>left_items_joined</w:t>
             </w:r>
             <w:proofErr w:type="spellEnd"/>
             <w:r>
@@ -2124,20 +1951,19 @@
               </w:rPr>
               <w:t>}</w:t>
             </w:r>
+          </w:p>
+          <w:p>
+            <w:pPr>
+              <w:pStyle w:val="BodyText"/>
+              <w:spacing w:before="85" w:line="259" w:lineRule="auto"/>
+              <w:ind w:left="0" w:right="38"/>
+            </w:pPr>
             <w:r>
               <w:rPr>
                 <w:sz w:val="20"/>
                 <w:szCs w:val="20"/>
               </w:rPr>
-              <w:t>{</w:t>
-            </w:r>
-            <w:proofErr w:type="gramEnd"/>
-            <w:r>
-              <w:rPr>
-                <w:sz w:val="20"/>
-                <w:szCs w:val="20"/>
-              </w:rPr>
-              <w:t>/}</w:t>
+              <w:t>{/}</w:t>
             </w:r>
           </w:p>
         </w:tc>
@@ -2150,21 +1976,17 @@
               <w:pStyle w:val="BodyText"/>
               <w:spacing w:before="85" w:line="259" w:lineRule="auto"/>
               <w:ind w:right="38"/>
+              <w:rPr>
+                <w:sz w:val="20"/>
+                <w:szCs w:val="20"/>
+              </w:rPr>
             </w:pPr>
             <w:r>
               <w:rPr>
                 <w:sz w:val="20"/>
                 <w:szCs w:val="20"/>
               </w:rPr>
-              <w:t>{#others_</w:t>
-            </w:r>
-            <w:proofErr w:type="gramStart"/>
-            <w:r>
-              <w:rPr>
-                <w:sz w:val="20"/>
-                <w:szCs w:val="20"/>
-              </w:rPr>
-              <w:t>rows}</w:t>
+              <w:t>{#others_rows}</w:t>
             </w:r>
             <w:r>
               <w:rPr>
@@ -2173,7 +1995,6 @@
               </w:rPr>
               <w:t>{</w:t>
             </w:r>
-            <w:proofErr w:type="gramEnd"/>
             <w:r>
               <w:rPr>
                 <w:sz w:val="20"/>
@@ -2181,7 +2002,6 @@
               </w:rPr>
               <w:t>#</w:t>
             </w:r>
-            <w:proofErr w:type="gramStart"/>
             <w:r>
               <w:rPr>
                 <w:sz w:val="20"/>
@@ -2196,17 +2016,7 @@
                 <w:sz w:val="20"/>
                 <w:szCs w:val="20"/>
               </w:rPr>
-              <w:t>{</w:t>
-            </w:r>
-            <w:proofErr w:type="gramEnd"/>
-            <w:r>
-              <w:rPr>
-                <w:b/>
-                <w:bCs/>
-                <w:sz w:val="20"/>
-                <w:szCs w:val="20"/>
-              </w:rPr>
-              <w:t>title}</w:t>
+              <w:t>{title}</w:t>
             </w:r>
             <w:r>
               <w:rPr>
@@ -2227,11 +2037,7 @@
             </w:r>
             <w:proofErr w:type="spellStart"/>
             <w:r>
-              <w:t>right_items_</w:t>
-            </w:r>
-            <w:proofErr w:type="gramStart"/>
-            <w:r>
-              <w:t>joined</w:t>
+              <w:t>right_items_joined</w:t>
             </w:r>
             <w:proofErr w:type="spellEnd"/>
             <w:r>
@@ -2258,20 +2064,19 @@
               </w:rPr>
               <w:t>}</w:t>
             </w:r>
+          </w:p>
+          <w:p>
+            <w:pPr>
+              <w:pStyle w:val="BodyText"/>
+              <w:spacing w:before="85" w:line="259" w:lineRule="auto"/>
+              <w:ind w:right="38"/>
+            </w:pPr>
             <w:r>
               <w:rPr>
                 <w:sz w:val="20"/>
                 <w:szCs w:val="20"/>
               </w:rPr>
-              <w:t>{</w:t>
-            </w:r>
-            <w:proofErr w:type="gramEnd"/>
-            <w:r>
-              <w:rPr>
-                <w:sz w:val="20"/>
-                <w:szCs w:val="20"/>
-              </w:rPr>
-              <w:t>/}</w:t>
+              <w:t>{/}</w:t>
             </w:r>
           </w:p>
           <w:p>
@@ -2340,9 +2145,8 @@
           <w:w w:val="90"/>
           <w:u w:color="003A9A"/>
         </w:rPr>
-        <w:t>{#</w:t>
-      </w:r>
-      <w:proofErr w:type="gramStart"/>
+        <w:t>{#hasReferences}</w:t>
+      </w:r>
       <w:r>
         <w:rPr>
           <w:b w:val="0"/>
@@ -2351,19 +2155,8 @@
           <w:w w:val="90"/>
           <w:u w:color="003A9A"/>
         </w:rPr>
-        <w:t>hasReferences}</w:t>
-      </w:r>
-      <w:r>
-        <w:rPr>
-          <w:b w:val="0"/>
-          <w:color w:val="003A9A"/>
-          <w:spacing w:val="-2"/>
-          <w:w w:val="90"/>
-          <w:u w:color="003A9A"/>
-        </w:rPr>
         <w:t>REFERENCE</w:t>
       </w:r>
-      <w:proofErr w:type="gramEnd"/>
       <w:r>
         <w:rPr>
           <w:b w:val="0"/>
@@ -2383,73 +2176,45 @@
         </w:rPr>
       </w:pPr>
       <w:r>
-        <w:t>{#</w:t>
-      </w:r>
-      <w:proofErr w:type="gramStart"/>
-      <w:r>
-        <w:t>references}</w:t>
+        <w:t>{#references}</w:t>
       </w:r>
       <w:r>
         <w:rPr>
           <w:rFonts w:ascii="Arial Black"/>
           <w:color w:val="737373"/>
         </w:rPr>
+        <w:t xml:space="preserve">{name} </w:t>
+      </w:r>
+      <w:r>
+        <w:rPr>
+          <w:color w:val="737373"/>
+        </w:rPr>
+        <w:t>{designation},</w:t>
+      </w:r>
+      <w:r>
+        <w:rPr>
+          <w:color w:val="737373"/>
+        </w:rPr>
+        <w:t xml:space="preserve"> </w:t>
+      </w:r>
+      <w:r>
+        <w:rPr>
+          <w:color w:val="737373"/>
+        </w:rPr>
         <w:t>{</w:t>
       </w:r>
-      <w:proofErr w:type="gramEnd"/>
-      <w:r>
-        <w:rPr>
-          <w:rFonts w:ascii="Arial Black"/>
-          <w:color w:val="737373"/>
-        </w:rPr>
-        <w:t xml:space="preserve">name} </w:t>
-      </w:r>
-      <w:r>
-        <w:rPr>
-          <w:color w:val="737373"/>
-        </w:rPr>
-        <w:t>{designation},</w:t>
-      </w:r>
-      <w:r>
-        <w:rPr>
-          <w:color w:val="737373"/>
-        </w:rPr>
-        <w:t xml:space="preserve"> </w:t>
-      </w:r>
-      <w:r>
-        <w:rPr>
-          <w:color w:val="737373"/>
-        </w:rPr>
-        <w:t>{</w:t>
-      </w:r>
       <w:r>
         <w:rPr>
           <w:color w:val="737373"/>
         </w:rPr>
         <w:t>#</w:t>
       </w:r>
-      <w:proofErr w:type="gramStart"/>
-      <w:r>
-        <w:rPr>
-          <w:color w:val="737373"/>
-        </w:rPr>
-        <w:t>company}{</w:t>
-      </w:r>
-      <w:proofErr w:type="gramEnd"/>
-      <w:r>
-        <w:rPr>
-          <w:color w:val="737373"/>
-        </w:rPr>
-        <w:t>company</w:t>
-      </w:r>
-      <w:proofErr w:type="gramStart"/>
-      <w:r>
-        <w:rPr>
-          <w:color w:val="737373"/>
-        </w:rPr>
-        <w:t>}{</w:t>
-      </w:r>
-      <w:proofErr w:type="gramEnd"/>
+      <w:r>
+        <w:rPr>
+          <w:color w:val="737373"/>
+        </w:rPr>
+        <w:t>company}{company}{</w:t>
+      </w:r>
       <w:r>
         <w:rPr>
           <w:color w:val="737373"/>
@@ -2491,28 +2256,24 @@
         </w:rPr>
         <w:t>#</w:t>
       </w:r>
-      <w:proofErr w:type="gramStart"/>
       <w:r>
         <w:rPr>
           <w:color w:val="737373"/>
         </w:rPr>
         <w:t>mobile}{</w:t>
       </w:r>
-      <w:proofErr w:type="gramEnd"/>
       <w:r>
         <w:rPr>
           <w:color w:val="737373"/>
         </w:rPr>
         <w:t>mobile</w:t>
       </w:r>
-      <w:proofErr w:type="gramStart"/>
       <w:r>
         <w:rPr>
           <w:color w:val="737373"/>
         </w:rPr>
         <w:t>}{</w:t>
       </w:r>
-      <w:proofErr w:type="gramEnd"/>
       <w:r>
         <w:rPr>
           <w:color w:val="737373"/>
@@ -2567,26 +2328,11 @@
         </w:rPr>
         <w:t>#</w:t>
       </w:r>
-      <w:proofErr w:type="gramStart"/>
-      <w:r>
-        <w:rPr>
-          <w:color w:val="737373"/>
-        </w:rPr>
-        <w:t>email}{</w:t>
-      </w:r>
-      <w:proofErr w:type="gramEnd"/>
-      <w:r>
-        <w:rPr>
-          <w:color w:val="737373"/>
-        </w:rPr>
-        <w:t>email</w:t>
-      </w:r>
-      <w:proofErr w:type="gramStart"/>
-      <w:r>
-        <w:rPr>
-          <w:color w:val="737373"/>
-        </w:rPr>
-        <w:t>}{</w:t>
+      <w:r>
+        <w:rPr>
+          <w:color w:val="737373"/>
+        </w:rPr>
+        <w:t>email}{email}{</w:t>
       </w:r>
       <w:r>
         <w:rPr>
@@ -2600,6 +2346,16 @@
         </w:rPr>
         <w:t>}</w:t>
       </w:r>
+    </w:p>
+    <w:p>
+      <w:pPr>
+        <w:pStyle w:val="BodyText"/>
+        <w:spacing w:before="135" w:line="259" w:lineRule="auto"/>
+        <w:ind w:left="141" w:right="1662"/>
+        <w:rPr>
+          <w:color w:val="737373"/>
+        </w:rPr>
+      </w:pPr>
       <w:r>
         <w:rPr>
           <w:color w:val="737373"/>
@@ -2624,7 +2380,6 @@
         </w:rPr>
         <w:t>{</w:t>
       </w:r>
-      <w:proofErr w:type="gramEnd"/>
       <w:r>
         <w:rPr>
           <w:color w:val="737373"/>
@@ -2653,7 +2408,7 @@
 <w:numbering xmlns:wpc="http://schemas.microsoft.com/office/word/2010/wordprocessingCanvas" xmlns:cx="http://schemas.microsoft.com/office/drawing/2014/chartex" xmlns:cx1="http://schemas.microsoft.com/office/drawing/2015/9/8/chartex" xmlns:cx2="http://schemas.microsoft.com/office/drawing/2015/10/21/chartex" xmlns:cx3="http://schemas.microsoft.com/office/drawing/2016/5/9/chartex" xmlns:cx4="http://schemas.microsoft.com/office/drawing/2016/5/10/chartex" xmlns:cx5="http://schemas.microsoft.com/office/drawing/2016/5/11/chartex" xmlns:cx6="http://schemas.microsoft.com/office/drawing/2016/5/12/chartex" xmlns:cx7="http://schemas.microsoft.com/office/drawing/2016/5/13/chartex" xmlns:cx8="http://schemas.microsoft.com/office/drawing/2016/5/14/chartex" xmlns:mc="http://schemas.openxmlformats.org/markup-compatibility/2006" xmlns:aink="http://schemas.microsoft.com/office/drawing/2016/ink" xmlns:am3d="http://schemas.microsoft.com/office/drawing/2017/model3d" xmlns:o="urn:schemas-microsoft-com:office:office" xmlns:oel="http://schemas.microsoft.com/office/2019/extlst" xmlns:r="http://schemas.openxmlformats.org/officeDocument/2006/relationships" xmlns:m="http://schemas.openxmlformats.org/officeDocument/2006/math" xmlns:v="urn:schemas-microsoft-com:vml" xmlns:wp14="http://schemas.microsoft.com/office/word/2010/wordprocessingDrawing" xmlns:wp="http://schemas.openxmlformats.org/drawingml/2006/wordprocessingDrawing" xmlns:w10="urn:schemas-microsoft-com:office:word" xmlns:w="http://schemas.openxmlformats.org/wordprocessingml/2006/main" xmlns:w14="http://schemas.microsoft.com/office/word/2010/wordml" xmlns:w15="http://schemas.microsoft.com/office/word/2012/wordml" xmlns:w16cex="http://schemas.microsoft.com/office/word/2018/wordml/cex" xmlns:w16cid="http://schemas.microsoft.com/office/word/2016/wordml/cid" xmlns:w16="http://schemas.microsoft.com/office/word/2018/wordml" xmlns:w16du="http://schemas.microsoft.com/office/word/2023/wordml/word16du" xmlns:w16sdtdh="http://schemas.microsoft.com/office/word/2020/wordml/sdtdatahash" xmlns:w16sdtfl="http://schemas.microsoft.com/office/word/2024/wordml/sdtformatlock" xmlns:w16se="http://schemas.microsoft.com/office/word/2015/wordml/symex" xmlns:wpg="http://schemas.microsoft.com/office/word/2010/wordprocessingGroup" xmlns:wpi="http://schemas.microsoft.com/office/word/2010/wordprocessingInk" xmlns:wne="http://schemas.microsoft.com/office/word/2006/wordml" xmlns:wps="http://schemas.microsoft.com/office/word/2010/wordprocessingShape" mc:Ignorable="w14 w15 w16se w16cid w16 w16cex w16sdtdh w16sdtfl w16du wp14">
   <w:numPicBullet w:numPicBulletId="0">
     <w:pict>
-      <v:shapetype w14:anchorId="26BB5CD1" id="_x0000_t75" coordsize="21600,21600" o:spt="75" o:preferrelative="t" path="m@4@5l@4@11@9@11@9@5xe" filled="f" stroked="f">
+      <v:shapetype id="_x0000_t75" coordsize="21600,21600" o:spt="75" o:preferrelative="t" path="m@4@5l@4@11@9@11@9@5xe" filled="f" stroked="f">
         <v:stroke joinstyle="miter"/>
         <v:formulas>
           <v:f eqn="if lineDrawn pixelLineWidth 0"/>
@@ -2672,7 +2427,7 @@
         <v:path o:extrusionok="f" gradientshapeok="t" o:connecttype="rect"/>
         <o:lock v:ext="edit" aspectratio="t"/>
       </v:shapetype>
-      <v:shape id="_x0000_i1045" type="#_x0000_t75" style="width:6pt;height:6pt" o:bullet="t">
+      <v:shape id="_x0000_i1079" type="#_x0000_t75" style="width:6pt;height:6pt" o:bullet="t">
         <v:imagedata r:id="rId1" o:title="image3"/>
       </v:shape>
     </w:pict>
@@ -3384,6 +3139,7 @@
   <w:style w:type="character" w:default="1" w:styleId="DefaultParagraphFont">
     <w:name w:val="Default Paragraph Font"/>
     <w:uiPriority w:val="1"/>
+    <w:semiHidden/>
     <w:unhideWhenUsed/>
   </w:style>
   <w:style w:type="table" w:default="1" w:styleId="TableNormal">

</xml_diff>

<commit_message>
fixed rate limit for big cvs
</commit_message>
<xml_diff>
--- a/public/cv_template.docx
+++ b/public/cv_template.docx
@@ -572,7 +572,7 @@
           </mc:Choice>
           <mc:Fallback>
             <w:pict>
-              <v:group w14:anchorId="7040A4F4" id="Group 2" o:spid="_x0000_s1026" style="position:absolute;margin-left:42.5pt;margin-top:4.9pt;width:14.7pt;height:14.7pt;z-index:251657216;mso-wrap-distance-left:0;mso-wrap-distance-right:0;mso-position-horizontal-relative:page" coordsize="186690,186690" o:gfxdata="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">
+              <v:group w14:anchorId="49710F8E" id="Group 2" o:spid="_x0000_s1026" style="position:absolute;margin-left:42.5pt;margin-top:4.9pt;width:14.7pt;height:14.7pt;z-index:251657216;mso-wrap-distance-left:0;mso-wrap-distance-right:0;mso-position-horizontal-relative:page" coordsize="186690,186690" o:gfxdata="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">
                 <v:shape id="Graphic 3" o:spid="_x0000_s1027" style="position:absolute;width:186690;height:186690;visibility:visible;mso-wrap-style:square;v-text-anchor:top" coordsize="186690,186690" o:gfxdata="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" path="m186213,186213l,186213,,,186213,r,186213xe" fillcolor="#003a9a" stroked="f">
                   <v:fill opacity="39321f"/>
                   <v:path arrowok="t"/>
@@ -995,7 +995,7 @@
           </mc:Choice>
           <mc:Fallback>
             <w:pict>
-              <v:group w14:anchorId="54BDF6E7" id="Group 5" o:spid="_x0000_s1026" style="position:absolute;margin-left:42.5pt;margin-top:24.05pt;width:14.7pt;height:14.7pt;z-index:251658240;mso-wrap-distance-left:0;mso-wrap-distance-right:0;mso-position-horizontal-relative:page" coordsize="186690,186690" o:gfxdata="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">
+              <v:group w14:anchorId="212B901B" id="Group 5" o:spid="_x0000_s1026" style="position:absolute;margin-left:42.5pt;margin-top:24.05pt;width:14.7pt;height:14.7pt;z-index:251658240;mso-wrap-distance-left:0;mso-wrap-distance-right:0;mso-position-horizontal-relative:page" coordsize="186690,186690" o:gfxdata="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">
                 <v:shape id="Graphic 6" o:spid="_x0000_s1027" style="position:absolute;width:186690;height:186690;visibility:visible;mso-wrap-style:square;v-text-anchor:top" coordsize="186690,186690" o:gfxdata="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" path="m186213,186213l,186213,,,186213,r,186213xe" fillcolor="#003a9a" stroked="f">
                   <v:fill opacity="39321f"/>
                   <v:path arrowok="t"/>
@@ -1083,8 +1083,9 @@
           <w:spacing w:val="-2"/>
           <w:u w:color="003A9A"/>
         </w:rPr>
-        <w:t>{#hasSummary}</w:t>
-      </w:r>
+        <w:t>{#</w:t>
+      </w:r>
+      <w:proofErr w:type="gramStart"/>
       <w:r>
         <w:rPr>
           <w:b w:val="0"/>
@@ -1092,8 +1093,18 @@
           <w:spacing w:val="-2"/>
           <w:u w:color="003A9A"/>
         </w:rPr>
+        <w:t>hasSummary}</w:t>
+      </w:r>
+      <w:r>
+        <w:rPr>
+          <w:b w:val="0"/>
+          <w:color w:val="003A9A"/>
+          <w:spacing w:val="-2"/>
+          <w:u w:color="003A9A"/>
+        </w:rPr>
         <w:t>SUMMARY</w:t>
       </w:r>
+      <w:proofErr w:type="gramEnd"/>
       <w:r>
         <w:rPr>
           <w:b w:val="0"/>
@@ -1126,7 +1137,15 @@
           <w:color w:val="737373"/>
           <w:sz w:val="18"/>
         </w:rPr>
-        <w:t>summary_text</w:t>
+        <w:t>summary_</w:t>
+      </w:r>
+      <w:proofErr w:type="gramStart"/>
+      <w:r>
+        <w:rPr>
+          <w:color w:val="737373"/>
+          <w:sz w:val="18"/>
+        </w:rPr>
+        <w:t>text</w:t>
       </w:r>
       <w:proofErr w:type="spellEnd"/>
       <w:r>
@@ -1134,7 +1153,15 @@
           <w:color w:val="737373"/>
           <w:sz w:val="18"/>
         </w:rPr>
-        <w:t>}{/}</w:t>
+        <w:t>}{</w:t>
+      </w:r>
+      <w:proofErr w:type="gramEnd"/>
+      <w:r>
+        <w:rPr>
+          <w:color w:val="737373"/>
+          <w:sz w:val="18"/>
+        </w:rPr>
+        <w:t>/}</w:t>
       </w:r>
     </w:p>
     <w:p>
@@ -1158,7 +1185,17 @@
           <w:w w:val="90"/>
           <w:u w:color="003A9A"/>
         </w:rPr>
-        <w:t>{#hasExperience}</w:t>
+        <w:t>{#</w:t>
+      </w:r>
+      <w:proofErr w:type="gramStart"/>
+      <w:r>
+        <w:rPr>
+          <w:color w:val="003A9A"/>
+          <w:spacing w:val="-2"/>
+          <w:w w:val="90"/>
+          <w:u w:color="003A9A"/>
+        </w:rPr>
+        <w:t>hasExperience}</w:t>
       </w:r>
       <w:r>
         <w:rPr>
@@ -1170,6 +1207,7 @@
         </w:rPr>
         <w:t>EXPERIENCE</w:t>
       </w:r>
+      <w:proofErr w:type="gramEnd"/>
       <w:r>
         <w:rPr>
           <w:b w:val="0"/>
@@ -1193,7 +1231,15 @@
           <w:color w:val="737373"/>
           <w:sz w:val="18"/>
         </w:rPr>
-        <w:t>{#experience}</w:t>
+        <w:t>{#</w:t>
+      </w:r>
+      <w:proofErr w:type="gramStart"/>
+      <w:r>
+        <w:rPr>
+          <w:color w:val="737373"/>
+          <w:sz w:val="18"/>
+        </w:rPr>
+        <w:t>experience}</w:t>
       </w:r>
       <w:r>
         <w:rPr>
@@ -1202,7 +1248,17 @@
           <w:sz w:val="19"/>
           <w:u w:val="single" w:color="737373"/>
         </w:rPr>
-        <w:t>{title}</w:t>
+        <w:t>{</w:t>
+      </w:r>
+      <w:proofErr w:type="gramEnd"/>
+      <w:r>
+        <w:rPr>
+          <w:rFonts w:ascii="Arial Black" w:hAnsi="Arial Black"/>
+          <w:color w:val="737373"/>
+          <w:sz w:val="19"/>
+          <w:u w:val="single" w:color="737373"/>
+        </w:rPr>
+        <w:t>title}</w:t>
       </w:r>
       <w:r>
         <w:rPr>
@@ -1329,8 +1385,9 @@
           <w:w w:val="95"/>
           <w:u w:color="003A9A"/>
         </w:rPr>
-        <w:t>{#hasEducation}</w:t>
-      </w:r>
+        <w:t>{#</w:t>
+      </w:r>
+      <w:proofErr w:type="gramStart"/>
       <w:r>
         <w:rPr>
           <w:b w:val="0"/>
@@ -1339,8 +1396,19 @@
           <w:w w:val="95"/>
           <w:u w:color="003A9A"/>
         </w:rPr>
+        <w:t>hasEducation}</w:t>
+      </w:r>
+      <w:r>
+        <w:rPr>
+          <w:b w:val="0"/>
+          <w:color w:val="003A9A"/>
+          <w:spacing w:val="-2"/>
+          <w:w w:val="95"/>
+          <w:u w:color="003A9A"/>
+        </w:rPr>
         <w:t>EDUCATION</w:t>
       </w:r>
+      <w:proofErr w:type="gramEnd"/>
       <w:r>
         <w:rPr>
           <w:b w:val="0"/>
@@ -1442,7 +1510,7 @@
           <w:color w:val="737373"/>
           <w:sz w:val="18"/>
         </w:rPr>
-        <w:t>Passing Year: {year}</w:t>
+        <w:t>{year}</w:t>
       </w:r>
       <w:r>
         <w:rPr>
@@ -1456,14 +1524,30 @@
           <w:color w:val="737373"/>
           <w:sz w:val="18"/>
         </w:rPr>
-        <w:t>{#result}</w:t>
-      </w:r>
-      <w:r>
-        <w:rPr>
-          <w:color w:val="737373"/>
-          <w:sz w:val="18"/>
-        </w:rPr>
-        <w:t>| {result}</w:t>
+        <w:t>{#</w:t>
+      </w:r>
+      <w:proofErr w:type="gramStart"/>
+      <w:r>
+        <w:rPr>
+          <w:color w:val="737373"/>
+          <w:sz w:val="18"/>
+        </w:rPr>
+        <w:t>result}</w:t>
+      </w:r>
+      <w:r>
+        <w:rPr>
+          <w:color w:val="737373"/>
+          <w:sz w:val="18"/>
+        </w:rPr>
+        <w:t>|</w:t>
+      </w:r>
+      <w:proofErr w:type="gramEnd"/>
+      <w:r>
+        <w:rPr>
+          <w:color w:val="737373"/>
+          <w:sz w:val="18"/>
+        </w:rPr>
+        <w:t xml:space="preserve"> {result}</w:t>
       </w:r>
       <w:r>
         <w:rPr>
@@ -1571,8 +1655,9 @@
           <w:w w:val="95"/>
           <w:u w:color="003A9A"/>
         </w:rPr>
-        <w:t>{#hasTraining}</w:t>
-      </w:r>
+        <w:t>{#</w:t>
+      </w:r>
+      <w:proofErr w:type="gramStart"/>
       <w:r>
         <w:rPr>
           <w:b w:val="0"/>
@@ -1581,8 +1666,19 @@
           <w:w w:val="95"/>
           <w:u w:color="003A9A"/>
         </w:rPr>
+        <w:t>hasTraining}</w:t>
+      </w:r>
+      <w:r>
+        <w:rPr>
+          <w:b w:val="0"/>
+          <w:color w:val="003A9A"/>
+          <w:spacing w:val="-2"/>
+          <w:w w:val="95"/>
+          <w:u w:color="003A9A"/>
+        </w:rPr>
         <w:t>TRAINING</w:t>
       </w:r>
+      <w:proofErr w:type="gramEnd"/>
       <w:r>
         <w:rPr>
           <w:b w:val="0"/>
@@ -1607,14 +1703,29 @@
         <w:rPr>
           <w:b w:val="0"/>
         </w:rPr>
-        <w:t>{#training}</w:t>
-      </w:r>
+        <w:t>{#</w:t>
+      </w:r>
+      <w:proofErr w:type="gramStart"/>
       <w:r>
         <w:rPr>
           <w:b w:val="0"/>
-          <w:color w:val="737373"/>
-        </w:rPr>
-        <w:t>{title}</w:t>
+        </w:rPr>
+        <w:t>training}</w:t>
+      </w:r>
+      <w:r>
+        <w:rPr>
+          <w:b w:val="0"/>
+          <w:color w:val="737373"/>
+        </w:rPr>
+        <w:t>{</w:t>
+      </w:r>
+      <w:proofErr w:type="gramEnd"/>
+      <w:r>
+        <w:rPr>
+          <w:b w:val="0"/>
+          <w:color w:val="737373"/>
+        </w:rPr>
+        <w:t>title}</w:t>
       </w:r>
       <w:r>
         <w:rPr>
@@ -1627,8 +1738,11 @@
     <w:p>
       <w:pPr>
         <w:pStyle w:val="BodyText"/>
+        <w:numPr>
+          <w:ilvl w:val="0"/>
+          <w:numId w:val="3"/>
+        </w:numPr>
         <w:spacing w:before="47"/>
-        <w:ind w:left="0" w:firstLine="216"/>
         <w:rPr>
           <w:color w:val="737373"/>
           <w:spacing w:val="2"/>
@@ -1653,13 +1767,22 @@
           <w:color w:val="737373"/>
           <w:spacing w:val="2"/>
         </w:rPr>
-        <w:t>{provider}{</w:t>
-      </w:r>
+        <w:t>{provider</w:t>
+      </w:r>
+      <w:proofErr w:type="gramStart"/>
       <w:r>
         <w:rPr>
           <w:color w:val="737373"/>
           <w:spacing w:val="2"/>
         </w:rPr>
+        <w:t>}{</w:t>
+      </w:r>
+      <w:proofErr w:type="gramEnd"/>
+      <w:r>
+        <w:rPr>
+          <w:color w:val="737373"/>
+          <w:spacing w:val="2"/>
+        </w:rPr>
         <w:t>/</w:t>
       </w:r>
       <w:r>
@@ -1676,12 +1799,62 @@
         </w:rPr>
         <w:t>#</w:t>
       </w:r>
+      <w:proofErr w:type="gramStart"/>
       <w:r>
         <w:rPr>
           <w:color w:val="737373"/>
           <w:spacing w:val="2"/>
         </w:rPr>
-        <w:t>year}{year}{</w:t>
+        <w:t>year}{</w:t>
+      </w:r>
+      <w:proofErr w:type="gramEnd"/>
+      <w:r>
+        <w:rPr>
+          <w:color w:val="737373"/>
+          <w:spacing w:val="2"/>
+        </w:rPr>
+        <w:t>year</w:t>
+      </w:r>
+      <w:proofErr w:type="gramStart"/>
+      <w:r>
+        <w:rPr>
+          <w:color w:val="737373"/>
+          <w:spacing w:val="2"/>
+        </w:rPr>
+        <w:t>}{</w:t>
+      </w:r>
+      <w:proofErr w:type="gramEnd"/>
+      <w:r>
+        <w:rPr>
+          <w:color w:val="737373"/>
+          <w:spacing w:val="2"/>
+        </w:rPr>
+        <w:t>/</w:t>
+      </w:r>
+      <w:r>
+        <w:rPr>
+          <w:color w:val="737373"/>
+          <w:spacing w:val="2"/>
+        </w:rPr>
+        <w:t>}</w:t>
+      </w:r>
+    </w:p>
+    <w:p>
+      <w:pPr>
+        <w:pStyle w:val="BodyText"/>
+        <w:spacing w:before="47"/>
+        <w:ind w:left="0" w:firstLine="576"/>
+        <w:rPr>
+          <w:color w:val="737373"/>
+          <w:spacing w:val="2"/>
+        </w:rPr>
+      </w:pPr>
+      <w:r>
+        <w:rPr>
+          <w:color w:val="737373"/>
+          <w:spacing w:val="2"/>
+        </w:rPr>
+        <w:t>{</w:t>
       </w:r>
       <w:r>
         <w:rPr>
@@ -1735,27 +1908,6 @@
         </w:rPr>
         <w:t>}</w:t>
       </w:r>
-      <w:r>
-        <w:rPr>
-          <w:color w:val="737373"/>
-          <w:spacing w:val="2"/>
-        </w:rPr>
-        <w:t>{</w:t>
-      </w:r>
-      <w:r>
-        <w:rPr>
-          <w:color w:val="737373"/>
-          <w:spacing w:val="2"/>
-        </w:rPr>
-        <w:t>/</w:t>
-      </w:r>
-      <w:r>
-        <w:rPr>
-          <w:color w:val="737373"/>
-          <w:spacing w:val="2"/>
-        </w:rPr>
-        <w:t>}</w:t>
-      </w:r>
     </w:p>
     <w:p>
       <w:pPr>
@@ -1794,8 +1946,9 @@
           <w:w w:val="95"/>
           <w:u w:color="003A9A"/>
         </w:rPr>
-        <w:t>#hasOthers</w:t>
-      </w:r>
+        <w:t>#</w:t>
+      </w:r>
+      <w:proofErr w:type="gramStart"/>
       <w:r>
         <w:rPr>
           <w:b w:val="0"/>
@@ -1804,7 +1957,7 @@
           <w:w w:val="95"/>
           <w:u w:color="003A9A"/>
         </w:rPr>
-        <w:t>}</w:t>
+        <w:t>hasOthers</w:t>
       </w:r>
       <w:r>
         <w:rPr>
@@ -1814,8 +1967,19 @@
           <w:w w:val="95"/>
           <w:u w:color="003A9A"/>
         </w:rPr>
+        <w:t>}</w:t>
+      </w:r>
+      <w:r>
+        <w:rPr>
+          <w:b w:val="0"/>
+          <w:color w:val="003A9A"/>
+          <w:spacing w:val="-2"/>
+          <w:w w:val="95"/>
+          <w:u w:color="003A9A"/>
+        </w:rPr>
         <w:t>OTHERS</w:t>
       </w:r>
+      <w:proofErr w:type="gramEnd"/>
       <w:r>
         <w:rPr>
           <w:b w:val="0"/>
@@ -1880,7 +2044,15 @@
                 <w:sz w:val="20"/>
                 <w:szCs w:val="20"/>
               </w:rPr>
-              <w:t>{#others_rows}</w:t>
+              <w:t>{#others_</w:t>
+            </w:r>
+            <w:proofErr w:type="gramStart"/>
+            <w:r>
+              <w:rPr>
+                <w:sz w:val="20"/>
+                <w:szCs w:val="20"/>
+              </w:rPr>
+              <w:t>rows}</w:t>
             </w:r>
             <w:r>
               <w:rPr>
@@ -1889,6 +2061,7 @@
               </w:rPr>
               <w:t>{</w:t>
             </w:r>
+            <w:proofErr w:type="gramEnd"/>
             <w:r>
               <w:rPr>
                 <w:sz w:val="20"/>
@@ -1896,6 +2069,7 @@
               </w:rPr>
               <w:t>#</w:t>
             </w:r>
+            <w:proofErr w:type="gramStart"/>
             <w:r>
               <w:rPr>
                 <w:sz w:val="20"/>
@@ -1910,7 +2084,17 @@
                 <w:sz w:val="20"/>
                 <w:szCs w:val="20"/>
               </w:rPr>
-              <w:t>{title}</w:t>
+              <w:t>{</w:t>
+            </w:r>
+            <w:proofErr w:type="gramEnd"/>
+            <w:r>
+              <w:rPr>
+                <w:b/>
+                <w:bCs/>
+                <w:sz w:val="20"/>
+                <w:szCs w:val="20"/>
+              </w:rPr>
+              <w:t>title}</w:t>
             </w:r>
             <w:r>
               <w:rPr>
@@ -1924,7 +2108,11 @@
             </w:r>
             <w:proofErr w:type="spellStart"/>
             <w:r>
-              <w:t>left_items_joined</w:t>
+              <w:t>left_items_</w:t>
+            </w:r>
+            <w:proofErr w:type="gramStart"/>
+            <w:r>
+              <w:t>joined</w:t>
             </w:r>
             <w:proofErr w:type="spellEnd"/>
             <w:r>
@@ -1937,6 +2125,7 @@
               </w:rPr>
               <w:t>{</w:t>
             </w:r>
+            <w:proofErr w:type="gramEnd"/>
             <w:r>
               <w:rPr>
                 <w:sz w:val="20"/>
@@ -1986,7 +2175,15 @@
                 <w:sz w:val="20"/>
                 <w:szCs w:val="20"/>
               </w:rPr>
-              <w:t>{#others_rows}</w:t>
+              <w:t>{#others_</w:t>
+            </w:r>
+            <w:proofErr w:type="gramStart"/>
+            <w:r>
+              <w:rPr>
+                <w:sz w:val="20"/>
+                <w:szCs w:val="20"/>
+              </w:rPr>
+              <w:t>rows}</w:t>
             </w:r>
             <w:r>
               <w:rPr>
@@ -1995,6 +2192,7 @@
               </w:rPr>
               <w:t>{</w:t>
             </w:r>
+            <w:proofErr w:type="gramEnd"/>
             <w:r>
               <w:rPr>
                 <w:sz w:val="20"/>
@@ -2002,6 +2200,7 @@
               </w:rPr>
               <w:t>#</w:t>
             </w:r>
+            <w:proofErr w:type="gramStart"/>
             <w:r>
               <w:rPr>
                 <w:sz w:val="20"/>
@@ -2016,7 +2215,17 @@
                 <w:sz w:val="20"/>
                 <w:szCs w:val="20"/>
               </w:rPr>
-              <w:t>{title}</w:t>
+              <w:t>{</w:t>
+            </w:r>
+            <w:proofErr w:type="gramEnd"/>
+            <w:r>
+              <w:rPr>
+                <w:b/>
+                <w:bCs/>
+                <w:sz w:val="20"/>
+                <w:szCs w:val="20"/>
+              </w:rPr>
+              <w:t>title}</w:t>
             </w:r>
             <w:r>
               <w:rPr>
@@ -2037,7 +2246,11 @@
             </w:r>
             <w:proofErr w:type="spellStart"/>
             <w:r>
-              <w:t>right_items_joined</w:t>
+              <w:t>right_items_</w:t>
+            </w:r>
+            <w:proofErr w:type="gramStart"/>
+            <w:r>
+              <w:t>joined</w:t>
             </w:r>
             <w:proofErr w:type="spellEnd"/>
             <w:r>
@@ -2050,6 +2263,7 @@
               </w:rPr>
               <w:t>{</w:t>
             </w:r>
+            <w:proofErr w:type="gramEnd"/>
             <w:r>
               <w:rPr>
                 <w:sz w:val="20"/>
@@ -2145,8 +2359,9 @@
           <w:w w:val="90"/>
           <w:u w:color="003A9A"/>
         </w:rPr>
-        <w:t>{#hasReferences}</w:t>
-      </w:r>
+        <w:t>{#</w:t>
+      </w:r>
+      <w:proofErr w:type="gramStart"/>
       <w:r>
         <w:rPr>
           <w:b w:val="0"/>
@@ -2155,8 +2370,19 @@
           <w:w w:val="90"/>
           <w:u w:color="003A9A"/>
         </w:rPr>
+        <w:t>hasReferences}</w:t>
+      </w:r>
+      <w:r>
+        <w:rPr>
+          <w:b w:val="0"/>
+          <w:color w:val="003A9A"/>
+          <w:spacing w:val="-2"/>
+          <w:w w:val="90"/>
+          <w:u w:color="003A9A"/>
+        </w:rPr>
         <w:t>REFERENCE</w:t>
       </w:r>
+      <w:proofErr w:type="gramEnd"/>
       <w:r>
         <w:rPr>
           <w:b w:val="0"/>
@@ -2176,14 +2402,26 @@
         </w:rPr>
       </w:pPr>
       <w:r>
-        <w:t>{#references}</w:t>
+        <w:t>{#</w:t>
+      </w:r>
+      <w:proofErr w:type="gramStart"/>
+      <w:r>
+        <w:t>references}</w:t>
       </w:r>
       <w:r>
         <w:rPr>
           <w:rFonts w:ascii="Arial Black"/>
           <w:color w:val="737373"/>
         </w:rPr>
-        <w:t xml:space="preserve">{name} </w:t>
+        <w:t>{</w:t>
+      </w:r>
+      <w:proofErr w:type="gramEnd"/>
+      <w:r>
+        <w:rPr>
+          <w:rFonts w:ascii="Arial Black"/>
+          <w:color w:val="737373"/>
+        </w:rPr>
+        <w:t xml:space="preserve">name} </w:t>
       </w:r>
       <w:r>
         <w:rPr>
@@ -2209,12 +2447,28 @@
         </w:rPr>
         <w:t>#</w:t>
       </w:r>
-      <w:r>
-        <w:rPr>
-          <w:color w:val="737373"/>
-        </w:rPr>
-        <w:t>company}{company}{</w:t>
-      </w:r>
+      <w:proofErr w:type="gramStart"/>
+      <w:r>
+        <w:rPr>
+          <w:color w:val="737373"/>
+        </w:rPr>
+        <w:t>company}{</w:t>
+      </w:r>
+      <w:proofErr w:type="gramEnd"/>
+      <w:r>
+        <w:rPr>
+          <w:color w:val="737373"/>
+        </w:rPr>
+        <w:t>company</w:t>
+      </w:r>
+      <w:proofErr w:type="gramStart"/>
+      <w:r>
+        <w:rPr>
+          <w:color w:val="737373"/>
+        </w:rPr>
+        <w:t>}{</w:t>
+      </w:r>
+      <w:proofErr w:type="gramEnd"/>
       <w:r>
         <w:rPr>
           <w:color w:val="737373"/>
@@ -2256,24 +2510,28 @@
         </w:rPr>
         <w:t>#</w:t>
       </w:r>
+      <w:proofErr w:type="gramStart"/>
       <w:r>
         <w:rPr>
           <w:color w:val="737373"/>
         </w:rPr>
         <w:t>mobile}{</w:t>
       </w:r>
+      <w:proofErr w:type="gramEnd"/>
       <w:r>
         <w:rPr>
           <w:color w:val="737373"/>
         </w:rPr>
         <w:t>mobile</w:t>
       </w:r>
+      <w:proofErr w:type="gramStart"/>
       <w:r>
         <w:rPr>
           <w:color w:val="737373"/>
         </w:rPr>
         <w:t>}{</w:t>
       </w:r>
+      <w:proofErr w:type="gramEnd"/>
       <w:r>
         <w:rPr>
           <w:color w:val="737373"/>
@@ -2328,12 +2586,28 @@
         </w:rPr>
         <w:t>#</w:t>
       </w:r>
-      <w:r>
-        <w:rPr>
-          <w:color w:val="737373"/>
-        </w:rPr>
-        <w:t>email}{email}{</w:t>
-      </w:r>
+      <w:proofErr w:type="gramStart"/>
+      <w:r>
+        <w:rPr>
+          <w:color w:val="737373"/>
+        </w:rPr>
+        <w:t>email}{</w:t>
+      </w:r>
+      <w:proofErr w:type="gramEnd"/>
+      <w:r>
+        <w:rPr>
+          <w:color w:val="737373"/>
+        </w:rPr>
+        <w:t>email</w:t>
+      </w:r>
+      <w:proofErr w:type="gramStart"/>
+      <w:r>
+        <w:rPr>
+          <w:color w:val="737373"/>
+        </w:rPr>
+        <w:t>}{</w:t>
+      </w:r>
+      <w:proofErr w:type="gramEnd"/>
       <w:r>
         <w:rPr>
           <w:color w:val="737373"/>
@@ -2427,7 +2701,7 @@
         <v:path o:extrusionok="f" gradientshapeok="t" o:connecttype="rect"/>
         <o:lock v:ext="edit" aspectratio="t"/>
       </v:shapetype>
-      <v:shape id="_x0000_i1079" type="#_x0000_t75" style="width:6pt;height:6pt" o:bullet="t">
+      <v:shape id="_x0000_i1102" type="#_x0000_t75" style="width:6pt;height:6pt" o:bullet="t">
         <v:imagedata r:id="rId1" o:title="image3"/>
       </v:shape>
     </w:pict>
@@ -2546,6 +2820,119 @@
     </w:lvl>
   </w:abstractNum>
   <w:abstractNum w:abstractNumId="1" w15:restartNumberingAfterBreak="0">
+    <w:nsid w:val="42C00EDF"/>
+    <w:multiLevelType w:val="hybridMultilevel"/>
+    <w:tmpl w:val="61BCCBD0"/>
+    <w:lvl w:ilvl="0" w:tplc="04090001">
+      <w:start w:val="1"/>
+      <w:numFmt w:val="bullet"/>
+      <w:lvlText w:val=""/>
+      <w:lvlJc w:val="left"/>
+      <w:pPr>
+        <w:ind w:left="936" w:hanging="360"/>
+      </w:pPr>
+      <w:rPr>
+        <w:rFonts w:ascii="Symbol" w:hAnsi="Symbol" w:hint="default"/>
+      </w:rPr>
+    </w:lvl>
+    <w:lvl w:ilvl="1" w:tplc="04090003" w:tentative="1">
+      <w:start w:val="1"/>
+      <w:numFmt w:val="bullet"/>
+      <w:lvlText w:val="o"/>
+      <w:lvlJc w:val="left"/>
+      <w:pPr>
+        <w:ind w:left="1656" w:hanging="360"/>
+      </w:pPr>
+      <w:rPr>
+        <w:rFonts w:ascii="Courier New" w:hAnsi="Courier New" w:cs="Courier New" w:hint="default"/>
+      </w:rPr>
+    </w:lvl>
+    <w:lvl w:ilvl="2" w:tplc="04090005" w:tentative="1">
+      <w:start w:val="1"/>
+      <w:numFmt w:val="bullet"/>
+      <w:lvlText w:val=""/>
+      <w:lvlJc w:val="left"/>
+      <w:pPr>
+        <w:ind w:left="2376" w:hanging="360"/>
+      </w:pPr>
+      <w:rPr>
+        <w:rFonts w:ascii="Wingdings" w:hAnsi="Wingdings" w:hint="default"/>
+      </w:rPr>
+    </w:lvl>
+    <w:lvl w:ilvl="3" w:tplc="04090001" w:tentative="1">
+      <w:start w:val="1"/>
+      <w:numFmt w:val="bullet"/>
+      <w:lvlText w:val=""/>
+      <w:lvlJc w:val="left"/>
+      <w:pPr>
+        <w:ind w:left="3096" w:hanging="360"/>
+      </w:pPr>
+      <w:rPr>
+        <w:rFonts w:ascii="Symbol" w:hAnsi="Symbol" w:hint="default"/>
+      </w:rPr>
+    </w:lvl>
+    <w:lvl w:ilvl="4" w:tplc="04090003" w:tentative="1">
+      <w:start w:val="1"/>
+      <w:numFmt w:val="bullet"/>
+      <w:lvlText w:val="o"/>
+      <w:lvlJc w:val="left"/>
+      <w:pPr>
+        <w:ind w:left="3816" w:hanging="360"/>
+      </w:pPr>
+      <w:rPr>
+        <w:rFonts w:ascii="Courier New" w:hAnsi="Courier New" w:cs="Courier New" w:hint="default"/>
+      </w:rPr>
+    </w:lvl>
+    <w:lvl w:ilvl="5" w:tplc="04090005" w:tentative="1">
+      <w:start w:val="1"/>
+      <w:numFmt w:val="bullet"/>
+      <w:lvlText w:val=""/>
+      <w:lvlJc w:val="left"/>
+      <w:pPr>
+        <w:ind w:left="4536" w:hanging="360"/>
+      </w:pPr>
+      <w:rPr>
+        <w:rFonts w:ascii="Wingdings" w:hAnsi="Wingdings" w:hint="default"/>
+      </w:rPr>
+    </w:lvl>
+    <w:lvl w:ilvl="6" w:tplc="04090001" w:tentative="1">
+      <w:start w:val="1"/>
+      <w:numFmt w:val="bullet"/>
+      <w:lvlText w:val=""/>
+      <w:lvlJc w:val="left"/>
+      <w:pPr>
+        <w:ind w:left="5256" w:hanging="360"/>
+      </w:pPr>
+      <w:rPr>
+        <w:rFonts w:ascii="Symbol" w:hAnsi="Symbol" w:hint="default"/>
+      </w:rPr>
+    </w:lvl>
+    <w:lvl w:ilvl="7" w:tplc="04090003" w:tentative="1">
+      <w:start w:val="1"/>
+      <w:numFmt w:val="bullet"/>
+      <w:lvlText w:val="o"/>
+      <w:lvlJc w:val="left"/>
+      <w:pPr>
+        <w:ind w:left="5976" w:hanging="360"/>
+      </w:pPr>
+      <w:rPr>
+        <w:rFonts w:ascii="Courier New" w:hAnsi="Courier New" w:cs="Courier New" w:hint="default"/>
+      </w:rPr>
+    </w:lvl>
+    <w:lvl w:ilvl="8" w:tplc="04090005" w:tentative="1">
+      <w:start w:val="1"/>
+      <w:numFmt w:val="bullet"/>
+      <w:lvlText w:val=""/>
+      <w:lvlJc w:val="left"/>
+      <w:pPr>
+        <w:ind w:left="6696" w:hanging="360"/>
+      </w:pPr>
+      <w:rPr>
+        <w:rFonts w:ascii="Wingdings" w:hAnsi="Wingdings" w:hint="default"/>
+      </w:rPr>
+    </w:lvl>
+  </w:abstractNum>
+  <w:abstractNum w:abstractNumId="2" w15:restartNumberingAfterBreak="0">
     <w:nsid w:val="56DC7060"/>
     <w:multiLevelType w:val="hybridMultilevel"/>
     <w:tmpl w:val="EA30B0D4"/>
@@ -2668,10 +3055,13 @@
     </w:lvl>
   </w:abstractNum>
   <w:num w:numId="1" w16cid:durableId="1968730785">
-    <w:abstractNumId w:val="1"/>
+    <w:abstractNumId w:val="2"/>
   </w:num>
   <w:num w:numId="2" w16cid:durableId="170342927">
     <w:abstractNumId w:val="0"/>
+  </w:num>
+  <w:num w:numId="3" w16cid:durableId="1237975267">
+    <w:abstractNumId w:val="1"/>
   </w:num>
 </w:numbering>
 </file>

</xml_diff>